<commit_message>
paper2: split the within-plant table, correct threshold-gap ranges, rebuild
Co-Authored-By: Claude Fable 5.1 <noreply@anthropic.com>
Claude-Session: https://claude.ai/code/session_01BowwkLMYwXCaivyHiAeZQc
</commit_message>
<xml_diff>
--- a/paper2/manuscript.docx
+++ b/paper2/manuscript.docx
@@ -300,7 +300,7 @@
         <w:pStyle w:val="FirstParagraph"/>
       </w:pPr>
       <w:r>
-        <w:t xml:space="preserve">Meta-learning is regularly proposed as the way to give an industrial anomaly detector a few-shot start in a new operating regime, and the evidence offered is usually a score table for the adapted model. That table cannot show whether the meta-learner trained, whether the K-shot adaptation changed the model, or how much of the score the model itself contributed. We ran a measurement study that answers those three questions for a plain detector, an LSTM autoencoder trained with first-order MAML on regimes carved from normal operation, on five public benchmarks (the SWaT, WADI and HAI 21.03 testbeds and the SMAP and MSL telemetry sets), with five seeds, support sizes from 1 to 100 windows, within-plant and cross-plant evaluation, strictly point-wise metrics, a threshold set without labels, and paired tests on 10,000 cells. Four instruments were added to the usual protocol: the norm of the meta-update per outer step, with a control that reproduces a common gradient-path fault in first-order MAML code that silently leaves the meta-model at its initialisation; the relative parameter change and the rank correlation of anomaly scores before and after adaptation, at three adaptation strengths; a parameter-free reference, the squared magnitude of the standardised window; and a per-stream task-diversity score. The corrected meta-learner trains, and the broken one leaves a signature only in the update norm, which was exactly zero in all 25 control runs while its loss curve looked ordinary. K-shot adaptation moved the autoencoder by 0.1–0.6 % of its parameter norm at the settings in use and left the ranking of windows with a rank correlation of 0.93–0.99; it changed AUROC by a few thousandths everywhere except SMAP, where it repaired a poor meta-initialisation to the level of a static model. The meta-learned detector never beat the static autoencoder by more than 0.01 AUROC within a plant, was 0.056 worse on HAI, and matched a statically pre-trained source model in all six transfer directions. On four of the five benchmarks no autoencoder, trained or meta-trained, beat the window magnitude, which a random untrained network reproduces with rank correlation 0.996–1.000; only HAI rewarded training, and there a flat autoencoder beat the recurrent one. The label-free threshold cost 0.15–0.26 F1 against the oracle, more than any modelling choice. Task diversity did not predict the meta-learning gain across 120 telemetry channels (Spearman −0.20). We release the code and tables and propose five measurements that a report of a meta-learned detector should include so that adaptation can be told from decoration.</w:t>
+        <w:t xml:space="preserve">Meta-learning is regularly proposed as the way to give an industrial anomaly detector a few-shot start in a new operating regime, and the evidence offered is usually a score table for the adapted model. That table cannot show whether the meta-learner trained, whether the K-shot adaptation changed the model, or how much of the score the model itself contributed. We ran a measurement study that answers those three questions for a plain detector, an LSTM autoencoder trained with first-order MAML on regimes carved from normal operation, on five public benchmarks (the SWaT, WADI and HAI 21.03 testbeds and the SMAP and MSL telemetry sets), with five seeds, support sizes from 1 to 100 windows, within-plant and cross-plant evaluation, strictly point-wise metrics, a threshold set without labels, and paired tests on every (seed, stream, K) cell of 11,180 result rows. Four instruments were added to the usual protocol: the norm of the meta-update per outer step, with a control that reproduces a common gradient-path fault in first-order MAML code that silently leaves the meta-model at its initialisation; the relative parameter change and the rank correlation of anomaly scores before and after adaptation, at three adaptation strengths; a parameter-free reference, the squared magnitude of the standardised window; and a per-stream task-diversity score. The corrected meta-learner trains, and the broken one leaves a signature only in the update norm, which was exactly zero in all 25 control runs while its loss curve looked ordinary. K-shot adaptation moved the autoencoder by 0.1–0.6 % of its parameter norm at the settings in use and left the ranking of windows with a rank correlation of 0.93–0.99; it changed AUROC by a few thousandths everywhere except SMAP, where it repaired a poor meta-initialisation to the level of a static model. The meta-learned detector never beat the static autoencoder by more than 0.01 AUROC within a plant, was 0.056 worse on HAI, and matched a statically pre-trained source model in all six transfer directions. On four of the five benchmarks no autoencoder, trained or meta-trained, beat the window magnitude, which a random untrained network reproduces with rank correlation 0.996–1.000; only HAI rewarded training, and there a flat autoencoder beat the recurrent one. The label-free threshold cost 0.06–0.25 F1 against the oracle, on four of the five benchmarks more than any modelling choice. Task diversity did not predict the meta-learning gain across 120 telemetry channels (Spearman −0.20). We release the code and tables and propose five measurements that a report of a meta-learned detector should include so that adaptation can be told from decoration.</w:t>
       </w:r>
     </w:p>
     <w:p>
@@ -1791,12 +1791,12 @@
         <w:pStyle w:val="BodyText"/>
       </w:pPr>
       <w:r>
-        <w:t xml:space="preserve">This paper is deliberately an offline study: the meta-model is trained once, adapted once with K windows, and scored on a fixed test stream. Online adaptation on a drifting stream, where a drift detector decides when to adapt, is a different problem with its own protocol, and we have treated it separately</w:t>
-      </w:r>
-      <w:r>
-        <w:t xml:space="preserve"> </w:t>
-      </w:r>
-      <w:hyperlink w:anchor="ref-kermenov2023drift">
+        <w:t xml:space="preserve">This paper is deliberately an offline study: the meta-model is trained once, adapted once with K windows, and scored on a fixed test stream. Online adaptation on a drifting stream, where a drift detector decides when to adapt, is a different problem with its own literature</w:t>
+      </w:r>
+      <w:r>
+        <w:t xml:space="preserve"> </w:t>
+      </w:r>
+      <w:hyperlink w:anchor="ref-gama2014drift">
         <w:r>
           <w:rPr>
             <w:rStyle w:val="Hyperlink"/>
@@ -1810,7 +1810,7 @@
       <w:r>
         <w:t xml:space="preserve"> </w:t>
       </w:r>
-      <w:hyperlink w:anchor="ref-gama2014drift">
+      <w:hyperlink w:anchor="ref-kermenov2023drift">
         <w:r>
           <w:rPr>
             <w:rStyle w:val="Hyperlink"/>
@@ -1819,7 +1819,7 @@
         </w:r>
       </w:hyperlink>
       <w:r>
-        <w:t xml:space="preserve">. Keeping the two apart is part of the point: the measurements here are about the meta-learner itself, with no gate, memory or threshold logic in the way.</w:t>
+        <w:t xml:space="preserve">, and we keep it out of this study. Keeping the two apart is part of the point: the measurements here are about the meta-learner itself, with no gate, memory or threshold logic in the way.</w:t>
       </w:r>
     </w:p>
     <w:bookmarkEnd w:id="24"/>
@@ -4125,7 +4125,7 @@
         <w:pStyle w:val="FirstParagraph"/>
       </w:pPr>
       <w:r>
-        <w:t xml:space="preserve">Table 3 gives AUROC and AUPRC at K = 20 for every method; Figure 2 shows AUROC against K. The first row is the detector with no parameters: the mean squared standardised value of the window.</w:t>
+        <w:t xml:space="preserve">Tables 3 and 4 give AUROC and AUPRC at K = 20 for every method; Figure 2 shows AUROC against K. The first row is the detector with no parameters: the mean squared standardised value of the window.</w:t>
       </w:r>
     </w:p>
     <w:p>
@@ -4133,7 +4133,7 @@
         <w:pStyle w:val="BodyText"/>
       </w:pPr>
       <w:r>
-        <w:t xml:space="preserve">Table 3. Within-plant detection at K = 20, AUROC and AUPRC, mean ± sd over five seeds. Scratch is a random LSTM autoencoder from a seed the meta-learner did not use.</w:t>
+        <w:t xml:space="preserve">Table 3. Within-plant detection at K = 20, AUROC, mean ± sd over five seeds. Scratch is a random LSTM autoencoder from a seed the meta-learner did not use.</w:t>
       </w:r>
     </w:p>
     <w:tbl>
@@ -4144,17 +4144,12 @@
         <w:jc w:val="start"/>
       </w:tblPr>
       <w:tblGrid>
-        <w:gridCol w:w="719"/>
-        <w:gridCol w:w="719"/>
-        <w:gridCol w:w="719"/>
-        <w:gridCol w:w="719"/>
-        <w:gridCol w:w="719"/>
-        <w:gridCol w:w="719"/>
-        <w:gridCol w:w="719"/>
-        <w:gridCol w:w="719"/>
-        <w:gridCol w:w="719"/>
-        <w:gridCol w:w="719"/>
-        <w:gridCol w:w="719"/>
+        <w:gridCol w:w="1320"/>
+        <w:gridCol w:w="1320"/>
+        <w:gridCol w:w="1320"/>
+        <w:gridCol w:w="1320"/>
+        <w:gridCol w:w="1320"/>
+        <w:gridCol w:w="1320"/>
       </w:tblGrid>
       <w:tr>
         <w:trPr>
@@ -4180,115 +4175,55 @@
               <w:jc w:val="left"/>
             </w:pPr>
             <w:r>
-              <w:t xml:space="preserve">SWaT AUROC</w:t>
-            </w:r>
-          </w:p>
-        </w:tc>
-        <w:tc>
-          <w:tcPr/>
-          <w:p>
-            <w:pPr>
-              <w:pStyle w:val="Compact"/>
-              <w:jc w:val="left"/>
-            </w:pPr>
-            <w:r>
-              <w:t xml:space="preserve">SWaT AUPRC</w:t>
-            </w:r>
-          </w:p>
-        </w:tc>
-        <w:tc>
-          <w:tcPr/>
-          <w:p>
-            <w:pPr>
-              <w:pStyle w:val="Compact"/>
-              <w:jc w:val="left"/>
-            </w:pPr>
-            <w:r>
-              <w:t xml:space="preserve">WADI AUROC</w:t>
-            </w:r>
-          </w:p>
-        </w:tc>
-        <w:tc>
-          <w:tcPr/>
-          <w:p>
-            <w:pPr>
-              <w:pStyle w:val="Compact"/>
-              <w:jc w:val="left"/>
-            </w:pPr>
-            <w:r>
-              <w:t xml:space="preserve">WADI AUPRC</w:t>
-            </w:r>
-          </w:p>
-        </w:tc>
-        <w:tc>
-          <w:tcPr/>
-          <w:p>
-            <w:pPr>
-              <w:pStyle w:val="Compact"/>
-              <w:jc w:val="left"/>
-            </w:pPr>
-            <w:r>
-              <w:t xml:space="preserve">HAI AUROC</w:t>
-            </w:r>
-          </w:p>
-        </w:tc>
-        <w:tc>
-          <w:tcPr/>
-          <w:p>
-            <w:pPr>
-              <w:pStyle w:val="Compact"/>
-              <w:jc w:val="left"/>
-            </w:pPr>
-            <w:r>
-              <w:t xml:space="preserve">HAI AUPRC</w:t>
-            </w:r>
-          </w:p>
-        </w:tc>
-        <w:tc>
-          <w:tcPr/>
-          <w:p>
-            <w:pPr>
-              <w:pStyle w:val="Compact"/>
-              <w:jc w:val="left"/>
-            </w:pPr>
-            <w:r>
-              <w:t xml:space="preserve">SMAP AUROC</w:t>
-            </w:r>
-          </w:p>
-        </w:tc>
-        <w:tc>
-          <w:tcPr/>
-          <w:p>
-            <w:pPr>
-              <w:pStyle w:val="Compact"/>
-              <w:jc w:val="left"/>
-            </w:pPr>
-            <w:r>
-              <w:t xml:space="preserve">SMAP AUPRC</w:t>
-            </w:r>
-          </w:p>
-        </w:tc>
-        <w:tc>
-          <w:tcPr/>
-          <w:p>
-            <w:pPr>
-              <w:pStyle w:val="Compact"/>
-              <w:jc w:val="left"/>
-            </w:pPr>
-            <w:r>
-              <w:t xml:space="preserve">MSL AUROC</w:t>
-            </w:r>
-          </w:p>
-        </w:tc>
-        <w:tc>
-          <w:tcPr/>
-          <w:p>
-            <w:pPr>
-              <w:pStyle w:val="Compact"/>
-              <w:jc w:val="left"/>
-            </w:pPr>
-            <w:r>
-              <w:t xml:space="preserve">MSL AUPRC</w:t>
+              <w:t xml:space="preserve">SWaT</w:t>
+            </w:r>
+          </w:p>
+        </w:tc>
+        <w:tc>
+          <w:tcPr/>
+          <w:p>
+            <w:pPr>
+              <w:pStyle w:val="Compact"/>
+              <w:jc w:val="left"/>
+            </w:pPr>
+            <w:r>
+              <w:t xml:space="preserve">WADI</w:t>
+            </w:r>
+          </w:p>
+        </w:tc>
+        <w:tc>
+          <w:tcPr/>
+          <w:p>
+            <w:pPr>
+              <w:pStyle w:val="Compact"/>
+              <w:jc w:val="left"/>
+            </w:pPr>
+            <w:r>
+              <w:t xml:space="preserve">HAI</w:t>
+            </w:r>
+          </w:p>
+        </w:tc>
+        <w:tc>
+          <w:tcPr/>
+          <w:p>
+            <w:pPr>
+              <w:pStyle w:val="Compact"/>
+              <w:jc w:val="left"/>
+            </w:pPr>
+            <w:r>
+              <w:t xml:space="preserve">SMAP</w:t>
+            </w:r>
+          </w:p>
+        </w:tc>
+        <w:tc>
+          <w:tcPr/>
+          <w:p>
+            <w:pPr>
+              <w:pStyle w:val="Compact"/>
+              <w:jc w:val="left"/>
+            </w:pPr>
+            <w:r>
+              <w:t xml:space="preserve">MSL</w:t>
             </w:r>
           </w:p>
         </w:tc>
@@ -4326,18 +4261,6 @@
               <w:jc w:val="left"/>
             </w:pPr>
             <w:r>
-              <w:t xml:space="preserve">0.769 ± 0.000</w:t>
-            </w:r>
-          </w:p>
-        </w:tc>
-        <w:tc>
-          <w:tcPr/>
-          <w:p>
-            <w:pPr>
-              <w:pStyle w:val="Compact"/>
-              <w:jc w:val="left"/>
-            </w:pPr>
-            <w:r>
               <w:t xml:space="preserve">0.673 ± 0.000</w:t>
             </w:r>
           </w:p>
@@ -4350,18 +4273,6 @@
               <w:jc w:val="left"/>
             </w:pPr>
             <w:r>
-              <w:t xml:space="preserve">0.181 ± 0.000</w:t>
-            </w:r>
-          </w:p>
-        </w:tc>
-        <w:tc>
-          <w:tcPr/>
-          <w:p>
-            <w:pPr>
-              <w:pStyle w:val="Compact"/>
-              <w:jc w:val="left"/>
-            </w:pPr>
-            <w:r>
               <w:t xml:space="preserve">0.855 ± 0.000</w:t>
             </w:r>
           </w:p>
@@ -4374,18 +4285,6 @@
               <w:jc w:val="left"/>
             </w:pPr>
             <w:r>
-              <w:t xml:space="preserve">0.280 ± 0.000</w:t>
-            </w:r>
-          </w:p>
-        </w:tc>
-        <w:tc>
-          <w:tcPr/>
-          <w:p>
-            <w:pPr>
-              <w:pStyle w:val="Compact"/>
-              <w:jc w:val="left"/>
-            </w:pPr>
-            <w:r>
               <w:t xml:space="preserve">0.605 ± 0.031</w:t>
             </w:r>
           </w:p>
@@ -4398,31 +4297,7 @@
               <w:jc w:val="left"/>
             </w:pPr>
             <w:r>
-              <w:t xml:space="preserve">0.245 ± 0.046</w:t>
-            </w:r>
-          </w:p>
-        </w:tc>
-        <w:tc>
-          <w:tcPr/>
-          <w:p>
-            <w:pPr>
-              <w:pStyle w:val="Compact"/>
-              <w:jc w:val="left"/>
-            </w:pPr>
-            <w:r>
               <w:t xml:space="preserve">0.610 ± 0.054</w:t>
-            </w:r>
-          </w:p>
-        </w:tc>
-        <w:tc>
-          <w:tcPr/>
-          <w:p>
-            <w:pPr>
-              <w:pStyle w:val="Compact"/>
-              <w:jc w:val="left"/>
-            </w:pPr>
-            <w:r>
-              <w:t xml:space="preserve">0.307 ± 0.054</w:t>
             </w:r>
           </w:p>
         </w:tc>
@@ -4460,18 +4335,6 @@
               <w:jc w:val="left"/>
             </w:pPr>
             <w:r>
-              <w:t xml:space="preserve">0.726 ± 0.005</w:t>
-            </w:r>
-          </w:p>
-        </w:tc>
-        <w:tc>
-          <w:tcPr/>
-          <w:p>
-            <w:pPr>
-              <w:pStyle w:val="Compact"/>
-              <w:jc w:val="left"/>
-            </w:pPr>
-            <w:r>
               <w:t xml:space="preserve">0.718 ± 0.007</w:t>
             </w:r>
           </w:p>
@@ -4484,18 +4347,6 @@
               <w:jc w:val="left"/>
             </w:pPr>
             <w:r>
-              <w:t xml:space="preserve">0.200 ± 0.017</w:t>
-            </w:r>
-          </w:p>
-        </w:tc>
-        <w:tc>
-          <w:tcPr/>
-          <w:p>
-            <w:pPr>
-              <w:pStyle w:val="Compact"/>
-              <w:jc w:val="left"/>
-            </w:pPr>
-            <w:r>
               <w:t xml:space="preserve">0.633 ± 0.006</w:t>
             </w:r>
           </w:p>
@@ -4508,18 +4359,6 @@
               <w:jc w:val="left"/>
             </w:pPr>
             <w:r>
-              <w:t xml:space="preserve">0.053 ± 0.004</w:t>
-            </w:r>
-          </w:p>
-        </w:tc>
-        <w:tc>
-          <w:tcPr/>
-          <w:p>
-            <w:pPr>
-              <w:pStyle w:val="Compact"/>
-              <w:jc w:val="left"/>
-            </w:pPr>
-            <w:r>
               <w:t xml:space="preserve">0.559 ± 0.030</w:t>
             </w:r>
           </w:p>
@@ -4532,31 +4371,7 @@
               <w:jc w:val="left"/>
             </w:pPr>
             <w:r>
-              <w:t xml:space="preserve">0.181 ± 0.050</w:t>
-            </w:r>
-          </w:p>
-        </w:tc>
-        <w:tc>
-          <w:tcPr/>
-          <w:p>
-            <w:pPr>
-              <w:pStyle w:val="Compact"/>
-              <w:jc w:val="left"/>
-            </w:pPr>
-            <w:r>
               <w:t xml:space="preserve">0.574 ± 0.055</w:t>
-            </w:r>
-          </w:p>
-        </w:tc>
-        <w:tc>
-          <w:tcPr/>
-          <w:p>
-            <w:pPr>
-              <w:pStyle w:val="Compact"/>
-              <w:jc w:val="left"/>
-            </w:pPr>
-            <w:r>
-              <w:t xml:space="preserve">0.244 ± 0.032</w:t>
             </w:r>
           </w:p>
         </w:tc>
@@ -4594,18 +4409,6 @@
               <w:jc w:val="left"/>
             </w:pPr>
             <w:r>
-              <w:t xml:space="preserve">0.776 ± 0.002</w:t>
-            </w:r>
-          </w:p>
-        </w:tc>
-        <w:tc>
-          <w:tcPr/>
-          <w:p>
-            <w:pPr>
-              <w:pStyle w:val="Compact"/>
-              <w:jc w:val="left"/>
-            </w:pPr>
-            <w:r>
               <w:t xml:space="preserve">0.579 ± 0.008</w:t>
             </w:r>
           </w:p>
@@ -4618,18 +4421,6 @@
               <w:jc w:val="left"/>
             </w:pPr>
             <w:r>
-              <w:t xml:space="preserve">0.100 ± 0.014</w:t>
-            </w:r>
-          </w:p>
-        </w:tc>
-        <w:tc>
-          <w:tcPr/>
-          <w:p>
-            <w:pPr>
-              <w:pStyle w:val="Compact"/>
-              <w:jc w:val="left"/>
-            </w:pPr>
-            <w:r>
               <w:t xml:space="preserve">0.933 ± 0.001</w:t>
             </w:r>
           </w:p>
@@ -4642,18 +4433,6 @@
               <w:jc w:val="left"/>
             </w:pPr>
             <w:r>
-              <w:t xml:space="preserve">0.344 ± 0.001</w:t>
-            </w:r>
-          </w:p>
-        </w:tc>
-        <w:tc>
-          <w:tcPr/>
-          <w:p>
-            <w:pPr>
-              <w:pStyle w:val="Compact"/>
-              <w:jc w:val="left"/>
-            </w:pPr>
-            <w:r>
               <w:t xml:space="preserve">0.599 ± 0.060</w:t>
             </w:r>
           </w:p>
@@ -4666,31 +4445,7 @@
               <w:jc w:val="left"/>
             </w:pPr>
             <w:r>
-              <w:t xml:space="preserve">0.245 ± 0.065</w:t>
-            </w:r>
-          </w:p>
-        </w:tc>
-        <w:tc>
-          <w:tcPr/>
-          <w:p>
-            <w:pPr>
-              <w:pStyle w:val="Compact"/>
-              <w:jc w:val="left"/>
-            </w:pPr>
-            <w:r>
               <w:t xml:space="preserve">0.573 ± 0.059</w:t>
-            </w:r>
-          </w:p>
-        </w:tc>
-        <w:tc>
-          <w:tcPr/>
-          <w:p>
-            <w:pPr>
-              <w:pStyle w:val="Compact"/>
-              <w:jc w:val="left"/>
-            </w:pPr>
-            <w:r>
-              <w:t xml:space="preserve">0.241 ± 0.071</w:t>
             </w:r>
           </w:p>
         </w:tc>
@@ -4728,18 +4483,6 @@
               <w:jc w:val="left"/>
             </w:pPr>
             <w:r>
-              <w:t xml:space="preserve">0.769 ± 0.008</w:t>
-            </w:r>
-          </w:p>
-        </w:tc>
-        <w:tc>
-          <w:tcPr/>
-          <w:p>
-            <w:pPr>
-              <w:pStyle w:val="Compact"/>
-              <w:jc w:val="left"/>
-            </w:pPr>
-            <w:r>
               <w:t xml:space="preserve">0.584 ± 0.004</w:t>
             </w:r>
           </w:p>
@@ -4752,18 +4495,6 @@
               <w:jc w:val="left"/>
             </w:pPr>
             <w:r>
-              <w:t xml:space="preserve">0.101 ± 0.011</w:t>
-            </w:r>
-          </w:p>
-        </w:tc>
-        <w:tc>
-          <w:tcPr/>
-          <w:p>
-            <w:pPr>
-              <w:pStyle w:val="Compact"/>
-              <w:jc w:val="left"/>
-            </w:pPr>
-            <w:r>
               <w:t xml:space="preserve">0.901 ± 0.004</w:t>
             </w:r>
           </w:p>
@@ -4776,18 +4507,6 @@
               <w:jc w:val="left"/>
             </w:pPr>
             <w:r>
-              <w:t xml:space="preserve">0.321 ± 0.008</w:t>
-            </w:r>
-          </w:p>
-        </w:tc>
-        <w:tc>
-          <w:tcPr/>
-          <w:p>
-            <w:pPr>
-              <w:pStyle w:val="Compact"/>
-              <w:jc w:val="left"/>
-            </w:pPr>
-            <w:r>
               <w:t xml:space="preserve">0.587 ± 0.052</w:t>
             </w:r>
           </w:p>
@@ -4800,31 +4519,7 @@
               <w:jc w:val="left"/>
             </w:pPr>
             <w:r>
-              <w:t xml:space="preserve">0.241 ± 0.059</w:t>
-            </w:r>
-          </w:p>
-        </w:tc>
-        <w:tc>
-          <w:tcPr/>
-          <w:p>
-            <w:pPr>
-              <w:pStyle w:val="Compact"/>
-              <w:jc w:val="left"/>
-            </w:pPr>
-            <w:r>
               <w:t xml:space="preserve">0.592 ± 0.067</w:t>
-            </w:r>
-          </w:p>
-        </w:tc>
-        <w:tc>
-          <w:tcPr/>
-          <w:p>
-            <w:pPr>
-              <w:pStyle w:val="Compact"/>
-              <w:jc w:val="left"/>
-            </w:pPr>
-            <w:r>
-              <w:t xml:space="preserve">0.287 ± 0.059</w:t>
             </w:r>
           </w:p>
         </w:tc>
@@ -4862,18 +4557,6 @@
               <w:jc w:val="left"/>
             </w:pPr>
             <w:r>
-              <w:t xml:space="preserve">0.769 ± 0.009</w:t>
-            </w:r>
-          </w:p>
-        </w:tc>
-        <w:tc>
-          <w:tcPr/>
-          <w:p>
-            <w:pPr>
-              <w:pStyle w:val="Compact"/>
-              <w:jc w:val="left"/>
-            </w:pPr>
-            <w:r>
               <w:t xml:space="preserve">0.582 ± 0.007</w:t>
             </w:r>
           </w:p>
@@ -4886,18 +4569,6 @@
               <w:jc w:val="left"/>
             </w:pPr>
             <w:r>
-              <w:t xml:space="preserve">0.101 ± 0.013</w:t>
-            </w:r>
-          </w:p>
-        </w:tc>
-        <w:tc>
-          <w:tcPr/>
-          <w:p>
-            <w:pPr>
-              <w:pStyle w:val="Compact"/>
-              <w:jc w:val="left"/>
-            </w:pPr>
-            <w:r>
               <w:t xml:space="preserve">0.900 ± 0.004</w:t>
             </w:r>
           </w:p>
@@ -4910,18 +4581,6 @@
               <w:jc w:val="left"/>
             </w:pPr>
             <w:r>
-              <w:t xml:space="preserve">0.319 ± 0.008</w:t>
-            </w:r>
-          </w:p>
-        </w:tc>
-        <w:tc>
-          <w:tcPr/>
-          <w:p>
-            <w:pPr>
-              <w:pStyle w:val="Compact"/>
-              <w:jc w:val="left"/>
-            </w:pPr>
-            <w:r>
               <w:t xml:space="preserve">0.592 ± 0.046</w:t>
             </w:r>
           </w:p>
@@ -4934,31 +4593,7 @@
               <w:jc w:val="left"/>
             </w:pPr>
             <w:r>
-              <w:t xml:space="preserve">0.250 ± 0.064</w:t>
-            </w:r>
-          </w:p>
-        </w:tc>
-        <w:tc>
-          <w:tcPr/>
-          <w:p>
-            <w:pPr>
-              <w:pStyle w:val="Compact"/>
-              <w:jc w:val="left"/>
-            </w:pPr>
-            <w:r>
               <w:t xml:space="preserve">0.585 ± 0.061</w:t>
-            </w:r>
-          </w:p>
-        </w:tc>
-        <w:tc>
-          <w:tcPr/>
-          <w:p>
-            <w:pPr>
-              <w:pStyle w:val="Compact"/>
-              <w:jc w:val="left"/>
-            </w:pPr>
-            <w:r>
-              <w:t xml:space="preserve">0.288 ± 0.058</w:t>
             </w:r>
           </w:p>
         </w:tc>
@@ -4996,18 +4631,6 @@
               <w:jc w:val="left"/>
             </w:pPr>
             <w:r>
-              <w:t xml:space="preserve">0.764 ± 0.003</w:t>
-            </w:r>
-          </w:p>
-        </w:tc>
-        <w:tc>
-          <w:tcPr/>
-          <w:p>
-            <w:pPr>
-              <w:pStyle w:val="Compact"/>
-              <w:jc w:val="left"/>
-            </w:pPr>
-            <w:r>
               <w:t xml:space="preserve">0.589 ± 0.042</w:t>
             </w:r>
           </w:p>
@@ -5020,18 +4643,6 @@
               <w:jc w:val="left"/>
             </w:pPr>
             <w:r>
-              <w:t xml:space="preserve">0.114 ± 0.026</w:t>
-            </w:r>
-          </w:p>
-        </w:tc>
-        <w:tc>
-          <w:tcPr/>
-          <w:p>
-            <w:pPr>
-              <w:pStyle w:val="Compact"/>
-              <w:jc w:val="left"/>
-            </w:pPr>
-            <w:r>
               <w:t xml:space="preserve">0.845 ± 0.021</w:t>
             </w:r>
           </w:p>
@@ -5044,18 +4655,6 @@
               <w:jc w:val="left"/>
             </w:pPr>
             <w:r>
-              <w:t xml:space="preserve">0.288 ± 0.004</w:t>
-            </w:r>
-          </w:p>
-        </w:tc>
-        <w:tc>
-          <w:tcPr/>
-          <w:p>
-            <w:pPr>
-              <w:pStyle w:val="Compact"/>
-              <w:jc w:val="left"/>
-            </w:pPr>
-            <w:r>
               <w:t xml:space="preserve">0.567 ± 0.043</w:t>
             </w:r>
           </w:p>
@@ -5068,31 +4667,7 @@
               <w:jc w:val="left"/>
             </w:pPr>
             <w:r>
-              <w:t xml:space="preserve">0.226 ± 0.050</w:t>
-            </w:r>
-          </w:p>
-        </w:tc>
-        <w:tc>
-          <w:tcPr/>
-          <w:p>
-            <w:pPr>
-              <w:pStyle w:val="Compact"/>
-              <w:jc w:val="left"/>
-            </w:pPr>
-            <w:r>
               <w:t xml:space="preserve">0.588 ± 0.058</w:t>
-            </w:r>
-          </w:p>
-        </w:tc>
-        <w:tc>
-          <w:tcPr/>
-          <w:p>
-            <w:pPr>
-              <w:pStyle w:val="Compact"/>
-              <w:jc w:val="left"/>
-            </w:pPr>
-            <w:r>
-              <w:t xml:space="preserve">0.288 ± 0.059</w:t>
             </w:r>
           </w:p>
         </w:tc>
@@ -5130,18 +4705,6 @@
               <w:jc w:val="left"/>
             </w:pPr>
             <w:r>
-              <w:t xml:space="preserve">0.764 ± 0.004</w:t>
-            </w:r>
-          </w:p>
-        </w:tc>
-        <w:tc>
-          <w:tcPr/>
-          <w:p>
-            <w:pPr>
-              <w:pStyle w:val="Compact"/>
-              <w:jc w:val="left"/>
-            </w:pPr>
-            <w:r>
               <w:t xml:space="preserve">0.592 ± 0.041</w:t>
             </w:r>
           </w:p>
@@ -5154,18 +4717,6 @@
               <w:jc w:val="left"/>
             </w:pPr>
             <w:r>
-              <w:t xml:space="preserve">0.116 ± 0.024</w:t>
-            </w:r>
-          </w:p>
-        </w:tc>
-        <w:tc>
-          <w:tcPr/>
-          <w:p>
-            <w:pPr>
-              <w:pStyle w:val="Compact"/>
-              <w:jc w:val="left"/>
-            </w:pPr>
-            <w:r>
               <w:t xml:space="preserve">0.846 ± 0.023</w:t>
             </w:r>
           </w:p>
@@ -5178,18 +4729,6 @@
               <w:jc w:val="left"/>
             </w:pPr>
             <w:r>
-              <w:t xml:space="preserve">0.284 ± 0.006</w:t>
-            </w:r>
-          </w:p>
-        </w:tc>
-        <w:tc>
-          <w:tcPr/>
-          <w:p>
-            <w:pPr>
-              <w:pStyle w:val="Compact"/>
-              <w:jc w:val="left"/>
-            </w:pPr>
-            <w:r>
               <w:t xml:space="preserve">0.597 ± 0.043</w:t>
             </w:r>
           </w:p>
@@ -5202,31 +4741,7 @@
               <w:jc w:val="left"/>
             </w:pPr>
             <w:r>
-              <w:t xml:space="preserve">0.237 ± 0.054</w:t>
-            </w:r>
-          </w:p>
-        </w:tc>
-        <w:tc>
-          <w:tcPr/>
-          <w:p>
-            <w:pPr>
-              <w:pStyle w:val="Compact"/>
-              <w:jc w:val="left"/>
-            </w:pPr>
-            <w:r>
               <w:t xml:space="preserve">0.589 ± 0.059</w:t>
-            </w:r>
-          </w:p>
-        </w:tc>
-        <w:tc>
-          <w:tcPr/>
-          <w:p>
-            <w:pPr>
-              <w:pStyle w:val="Compact"/>
-              <w:jc w:val="left"/>
-            </w:pPr>
-            <w:r>
-              <w:t xml:space="preserve">0.288 ± 0.060</w:t>
             </w:r>
           </w:p>
         </w:tc>
@@ -5264,18 +4779,6 @@
               <w:jc w:val="left"/>
             </w:pPr>
             <w:r>
-              <w:t xml:space="preserve">0.762 ± 0.005</w:t>
-            </w:r>
-          </w:p>
-        </w:tc>
-        <w:tc>
-          <w:tcPr/>
-          <w:p>
-            <w:pPr>
-              <w:pStyle w:val="Compact"/>
-              <w:jc w:val="left"/>
-            </w:pPr>
-            <w:r>
               <w:t xml:space="preserve">0.586 ± 0.047</w:t>
             </w:r>
           </w:p>
@@ -5288,18 +4791,6 @@
               <w:jc w:val="left"/>
             </w:pPr>
             <w:r>
-              <w:t xml:space="preserve">0.116 ± 0.022</w:t>
-            </w:r>
-          </w:p>
-        </w:tc>
-        <w:tc>
-          <w:tcPr/>
-          <w:p>
-            <w:pPr>
-              <w:pStyle w:val="Compact"/>
-              <w:jc w:val="left"/>
-            </w:pPr>
-            <w:r>
               <w:t xml:space="preserve">0.844 ± 0.031</w:t>
             </w:r>
           </w:p>
@@ -5312,18 +4803,6 @@
               <w:jc w:val="left"/>
             </w:pPr>
             <w:r>
-              <w:t xml:space="preserve">0.283 ± 0.015</w:t>
-            </w:r>
-          </w:p>
-        </w:tc>
-        <w:tc>
-          <w:tcPr/>
-          <w:p>
-            <w:pPr>
-              <w:pStyle w:val="Compact"/>
-              <w:jc w:val="left"/>
-            </w:pPr>
-            <w:r>
               <w:t xml:space="preserve">0.594 ± 0.044</w:t>
             </w:r>
           </w:p>
@@ -5336,31 +4815,7 @@
               <w:jc w:val="left"/>
             </w:pPr>
             <w:r>
-              <w:t xml:space="preserve">0.255 ± 0.064</w:t>
-            </w:r>
-          </w:p>
-        </w:tc>
-        <w:tc>
-          <w:tcPr/>
-          <w:p>
-            <w:pPr>
-              <w:pStyle w:val="Compact"/>
-              <w:jc w:val="left"/>
-            </w:pPr>
-            <w:r>
               <w:t xml:space="preserve">0.591 ± 0.057</w:t>
-            </w:r>
-          </w:p>
-        </w:tc>
-        <w:tc>
-          <w:tcPr/>
-          <w:p>
-            <w:pPr>
-              <w:pStyle w:val="Compact"/>
-              <w:jc w:val="left"/>
-            </w:pPr>
-            <w:r>
-              <w:t xml:space="preserve">0.288 ± 0.059</w:t>
             </w:r>
           </w:p>
         </w:tc>
@@ -5398,18 +4853,6 @@
               <w:jc w:val="left"/>
             </w:pPr>
             <w:r>
-              <w:t xml:space="preserve">0.769 ± 0.000</w:t>
-            </w:r>
-          </w:p>
-        </w:tc>
-        <w:tc>
-          <w:tcPr/>
-          <w:p>
-            <w:pPr>
-              <w:pStyle w:val="Compact"/>
-              <w:jc w:val="left"/>
-            </w:pPr>
-            <w:r>
               <w:t xml:space="preserve">0.672 ± 0.001</w:t>
             </w:r>
           </w:p>
@@ -5422,18 +4865,6 @@
               <w:jc w:val="left"/>
             </w:pPr>
             <w:r>
-              <w:t xml:space="preserve">0.180 ± 0.001</w:t>
-            </w:r>
-          </w:p>
-        </w:tc>
-        <w:tc>
-          <w:tcPr/>
-          <w:p>
-            <w:pPr>
-              <w:pStyle w:val="Compact"/>
-              <w:jc w:val="left"/>
-            </w:pPr>
-            <w:r>
               <w:t xml:space="preserve">0.854 ± 0.001</w:t>
             </w:r>
           </w:p>
@@ -5446,18 +4877,6 @@
               <w:jc w:val="left"/>
             </w:pPr>
             <w:r>
-              <w:t xml:space="preserve">0.280 ± 0.001</w:t>
-            </w:r>
-          </w:p>
-        </w:tc>
-        <w:tc>
-          <w:tcPr/>
-          <w:p>
-            <w:pPr>
-              <w:pStyle w:val="Compact"/>
-              <w:jc w:val="left"/>
-            </w:pPr>
-            <w:r>
               <w:t xml:space="preserve">0.605 ± 0.033</w:t>
             </w:r>
           </w:p>
@@ -5470,31 +4889,7 @@
               <w:jc w:val="left"/>
             </w:pPr>
             <w:r>
-              <w:t xml:space="preserve">0.241 ± 0.050</w:t>
-            </w:r>
-          </w:p>
-        </w:tc>
-        <w:tc>
-          <w:tcPr/>
-          <w:p>
-            <w:pPr>
-              <w:pStyle w:val="Compact"/>
-              <w:jc w:val="left"/>
-            </w:pPr>
-            <w:r>
               <w:t xml:space="preserve">0.606 ± 0.055</w:t>
-            </w:r>
-          </w:p>
-        </w:tc>
-        <w:tc>
-          <w:tcPr/>
-          <w:p>
-            <w:pPr>
-              <w:pStyle w:val="Compact"/>
-              <w:jc w:val="left"/>
-            </w:pPr>
-            <w:r>
-              <w:t xml:space="preserve">0.306 ± 0.054</w:t>
             </w:r>
           </w:p>
         </w:tc>
@@ -5532,6 +4927,169 @@
               <w:jc w:val="left"/>
             </w:pPr>
             <w:r>
+              <w:t xml:space="preserve">0.672 ± 0.001</w:t>
+            </w:r>
+          </w:p>
+        </w:tc>
+        <w:tc>
+          <w:tcPr/>
+          <w:p>
+            <w:pPr>
+              <w:pStyle w:val="Compact"/>
+              <w:jc w:val="left"/>
+            </w:pPr>
+            <w:r>
+              <w:t xml:space="preserve">0.854 ± 0.001</w:t>
+            </w:r>
+          </w:p>
+        </w:tc>
+        <w:tc>
+          <w:tcPr/>
+          <w:p>
+            <w:pPr>
+              <w:pStyle w:val="Compact"/>
+              <w:jc w:val="left"/>
+            </w:pPr>
+            <w:r>
+              <w:t xml:space="preserve">0.607 ± 0.033</w:t>
+            </w:r>
+          </w:p>
+        </w:tc>
+        <w:tc>
+          <w:tcPr/>
+          <w:p>
+            <w:pPr>
+              <w:pStyle w:val="Compact"/>
+              <w:jc w:val="left"/>
+            </w:pPr>
+            <w:r>
+              <w:t xml:space="preserve">0.609 ± 0.058</w:t>
+            </w:r>
+          </w:p>
+        </w:tc>
+      </w:tr>
+    </w:tbl>
+    <w:p>
+      <w:pPr>
+        <w:pStyle w:val="BodyText"/>
+      </w:pPr>
+      <w:r>
+        <w:t xml:space="preserve">Table 4. Within-plant detection at K = 20, AUPRC, mean ± sd over five seeds.</w:t>
+      </w:r>
+    </w:p>
+    <w:tbl>
+      <w:tblPr>
+        <w:tblStyle w:val="Table"/>
+        <w:tblW w:type="pct" w:w="5000"/>
+        <w:tblLook w:firstRow="1" w:lastRow="0" w:firstColumn="0" w:lastColumn="0" w:noHBand="0" w:noVBand="0" w:val="0020"/>
+        <w:jc w:val="start"/>
+      </w:tblPr>
+      <w:tblGrid>
+        <w:gridCol w:w="1320"/>
+        <w:gridCol w:w="1320"/>
+        <w:gridCol w:w="1320"/>
+        <w:gridCol w:w="1320"/>
+        <w:gridCol w:w="1320"/>
+        <w:gridCol w:w="1320"/>
+      </w:tblGrid>
+      <w:tr>
+        <w:trPr>
+          <w:tblHeader w:val="true"/>
+        </w:trPr>
+        <w:tc>
+          <w:tcPr/>
+          <w:p>
+            <w:pPr>
+              <w:pStyle w:val="Compact"/>
+              <w:jc w:val="left"/>
+            </w:pPr>
+            <w:r>
+              <w:t xml:space="preserve">method</w:t>
+            </w:r>
+          </w:p>
+        </w:tc>
+        <w:tc>
+          <w:tcPr/>
+          <w:p>
+            <w:pPr>
+              <w:pStyle w:val="Compact"/>
+              <w:jc w:val="left"/>
+            </w:pPr>
+            <w:r>
+              <w:t xml:space="preserve">SWaT</w:t>
+            </w:r>
+          </w:p>
+        </w:tc>
+        <w:tc>
+          <w:tcPr/>
+          <w:p>
+            <w:pPr>
+              <w:pStyle w:val="Compact"/>
+              <w:jc w:val="left"/>
+            </w:pPr>
+            <w:r>
+              <w:t xml:space="preserve">WADI</w:t>
+            </w:r>
+          </w:p>
+        </w:tc>
+        <w:tc>
+          <w:tcPr/>
+          <w:p>
+            <w:pPr>
+              <w:pStyle w:val="Compact"/>
+              <w:jc w:val="left"/>
+            </w:pPr>
+            <w:r>
+              <w:t xml:space="preserve">HAI</w:t>
+            </w:r>
+          </w:p>
+        </w:tc>
+        <w:tc>
+          <w:tcPr/>
+          <w:p>
+            <w:pPr>
+              <w:pStyle w:val="Compact"/>
+              <w:jc w:val="left"/>
+            </w:pPr>
+            <w:r>
+              <w:t xml:space="preserve">SMAP</w:t>
+            </w:r>
+          </w:p>
+        </w:tc>
+        <w:tc>
+          <w:tcPr/>
+          <w:p>
+            <w:pPr>
+              <w:pStyle w:val="Compact"/>
+              <w:jc w:val="left"/>
+            </w:pPr>
+            <w:r>
+              <w:t xml:space="preserve">MSL</w:t>
+            </w:r>
+          </w:p>
+        </w:tc>
+      </w:tr>
+      <w:tr>
+        <w:tc>
+          <w:tcPr/>
+          <w:p>
+            <w:pPr>
+              <w:pStyle w:val="Compact"/>
+              <w:jc w:val="left"/>
+            </w:pPr>
+            <w:r>
+              <w:t xml:space="preserve">Magnitude</w:t>
+            </w:r>
+          </w:p>
+        </w:tc>
+        <w:tc>
+          <w:tcPr/>
+          <w:p>
+            <w:pPr>
+              <w:pStyle w:val="Compact"/>
+              <w:jc w:val="left"/>
+            </w:pPr>
+            <w:r>
               <w:t xml:space="preserve">0.769 ± 0.000</w:t>
             </w:r>
           </w:p>
@@ -5544,7 +5102,661 @@
               <w:jc w:val="left"/>
             </w:pPr>
             <w:r>
-              <w:t xml:space="preserve">0.672 ± 0.001</w:t>
+              <w:t xml:space="preserve">0.181 ± 0.000</w:t>
+            </w:r>
+          </w:p>
+        </w:tc>
+        <w:tc>
+          <w:tcPr/>
+          <w:p>
+            <w:pPr>
+              <w:pStyle w:val="Compact"/>
+              <w:jc w:val="left"/>
+            </w:pPr>
+            <w:r>
+              <w:t xml:space="preserve">0.280 ± 0.000</w:t>
+            </w:r>
+          </w:p>
+        </w:tc>
+        <w:tc>
+          <w:tcPr/>
+          <w:p>
+            <w:pPr>
+              <w:pStyle w:val="Compact"/>
+              <w:jc w:val="left"/>
+            </w:pPr>
+            <w:r>
+              <w:t xml:space="preserve">0.245 ± 0.046</w:t>
+            </w:r>
+          </w:p>
+        </w:tc>
+        <w:tc>
+          <w:tcPr/>
+          <w:p>
+            <w:pPr>
+              <w:pStyle w:val="Compact"/>
+              <w:jc w:val="left"/>
+            </w:pPr>
+            <w:r>
+              <w:t xml:space="preserve">0.307 ± 0.054</w:t>
+            </w:r>
+          </w:p>
+        </w:tc>
+      </w:tr>
+      <w:tr>
+        <w:tc>
+          <w:tcPr/>
+          <w:p>
+            <w:pPr>
+              <w:pStyle w:val="Compact"/>
+              <w:jc w:val="left"/>
+            </w:pPr>
+            <w:r>
+              <w:t xml:space="preserve">Isolation Forest</w:t>
+            </w:r>
+          </w:p>
+        </w:tc>
+        <w:tc>
+          <w:tcPr/>
+          <w:p>
+            <w:pPr>
+              <w:pStyle w:val="Compact"/>
+              <w:jc w:val="left"/>
+            </w:pPr>
+            <w:r>
+              <w:t xml:space="preserve">0.726 ± 0.005</w:t>
+            </w:r>
+          </w:p>
+        </w:tc>
+        <w:tc>
+          <w:tcPr/>
+          <w:p>
+            <w:pPr>
+              <w:pStyle w:val="Compact"/>
+              <w:jc w:val="left"/>
+            </w:pPr>
+            <w:r>
+              <w:t xml:space="preserve">0.200 ± 0.017</w:t>
+            </w:r>
+          </w:p>
+        </w:tc>
+        <w:tc>
+          <w:tcPr/>
+          <w:p>
+            <w:pPr>
+              <w:pStyle w:val="Compact"/>
+              <w:jc w:val="left"/>
+            </w:pPr>
+            <w:r>
+              <w:t xml:space="preserve">0.053 ± 0.004</w:t>
+            </w:r>
+          </w:p>
+        </w:tc>
+        <w:tc>
+          <w:tcPr/>
+          <w:p>
+            <w:pPr>
+              <w:pStyle w:val="Compact"/>
+              <w:jc w:val="left"/>
+            </w:pPr>
+            <w:r>
+              <w:t xml:space="preserve">0.181 ± 0.050</w:t>
+            </w:r>
+          </w:p>
+        </w:tc>
+        <w:tc>
+          <w:tcPr/>
+          <w:p>
+            <w:pPr>
+              <w:pStyle w:val="Compact"/>
+              <w:jc w:val="left"/>
+            </w:pPr>
+            <w:r>
+              <w:t xml:space="preserve">0.244 ± 0.032</w:t>
+            </w:r>
+          </w:p>
+        </w:tc>
+      </w:tr>
+      <w:tr>
+        <w:tc>
+          <w:tcPr/>
+          <w:p>
+            <w:pPr>
+              <w:pStyle w:val="Compact"/>
+              <w:jc w:val="left"/>
+            </w:pPr>
+            <w:r>
+              <w:t xml:space="preserve">MLP-AE</w:t>
+            </w:r>
+          </w:p>
+        </w:tc>
+        <w:tc>
+          <w:tcPr/>
+          <w:p>
+            <w:pPr>
+              <w:pStyle w:val="Compact"/>
+              <w:jc w:val="left"/>
+            </w:pPr>
+            <w:r>
+              <w:t xml:space="preserve">0.776 ± 0.002</w:t>
+            </w:r>
+          </w:p>
+        </w:tc>
+        <w:tc>
+          <w:tcPr/>
+          <w:p>
+            <w:pPr>
+              <w:pStyle w:val="Compact"/>
+              <w:jc w:val="left"/>
+            </w:pPr>
+            <w:r>
+              <w:t xml:space="preserve">0.100 ± 0.014</w:t>
+            </w:r>
+          </w:p>
+        </w:tc>
+        <w:tc>
+          <w:tcPr/>
+          <w:p>
+            <w:pPr>
+              <w:pStyle w:val="Compact"/>
+              <w:jc w:val="left"/>
+            </w:pPr>
+            <w:r>
+              <w:t xml:space="preserve">0.344 ± 0.001</w:t>
+            </w:r>
+          </w:p>
+        </w:tc>
+        <w:tc>
+          <w:tcPr/>
+          <w:p>
+            <w:pPr>
+              <w:pStyle w:val="Compact"/>
+              <w:jc w:val="left"/>
+            </w:pPr>
+            <w:r>
+              <w:t xml:space="preserve">0.245 ± 0.065</w:t>
+            </w:r>
+          </w:p>
+        </w:tc>
+        <w:tc>
+          <w:tcPr/>
+          <w:p>
+            <w:pPr>
+              <w:pStyle w:val="Compact"/>
+              <w:jc w:val="left"/>
+            </w:pPr>
+            <w:r>
+              <w:t xml:space="preserve">0.241 ± 0.071</w:t>
+            </w:r>
+          </w:p>
+        </w:tc>
+      </w:tr>
+      <w:tr>
+        <w:tc>
+          <w:tcPr/>
+          <w:p>
+            <w:pPr>
+              <w:pStyle w:val="Compact"/>
+              <w:jc w:val="left"/>
+            </w:pPr>
+            <w:r>
+              <w:t xml:space="preserve">Static-AE</w:t>
+            </w:r>
+          </w:p>
+        </w:tc>
+        <w:tc>
+          <w:tcPr/>
+          <w:p>
+            <w:pPr>
+              <w:pStyle w:val="Compact"/>
+              <w:jc w:val="left"/>
+            </w:pPr>
+            <w:r>
+              <w:t xml:space="preserve">0.769 ± 0.008</w:t>
+            </w:r>
+          </w:p>
+        </w:tc>
+        <w:tc>
+          <w:tcPr/>
+          <w:p>
+            <w:pPr>
+              <w:pStyle w:val="Compact"/>
+              <w:jc w:val="left"/>
+            </w:pPr>
+            <w:r>
+              <w:t xml:space="preserve">0.101 ± 0.011</w:t>
+            </w:r>
+          </w:p>
+        </w:tc>
+        <w:tc>
+          <w:tcPr/>
+          <w:p>
+            <w:pPr>
+              <w:pStyle w:val="Compact"/>
+              <w:jc w:val="left"/>
+            </w:pPr>
+            <w:r>
+              <w:t xml:space="preserve">0.321 ± 0.008</w:t>
+            </w:r>
+          </w:p>
+        </w:tc>
+        <w:tc>
+          <w:tcPr/>
+          <w:p>
+            <w:pPr>
+              <w:pStyle w:val="Compact"/>
+              <w:jc w:val="left"/>
+            </w:pPr>
+            <w:r>
+              <w:t xml:space="preserve">0.241 ± 0.059</w:t>
+            </w:r>
+          </w:p>
+        </w:tc>
+        <w:tc>
+          <w:tcPr/>
+          <w:p>
+            <w:pPr>
+              <w:pStyle w:val="Compact"/>
+              <w:jc w:val="left"/>
+            </w:pPr>
+            <w:r>
+              <w:t xml:space="preserve">0.287 ± 0.059</w:t>
+            </w:r>
+          </w:p>
+        </w:tc>
+      </w:tr>
+      <w:tr>
+        <w:tc>
+          <w:tcPr/>
+          <w:p>
+            <w:pPr>
+              <w:pStyle w:val="Compact"/>
+              <w:jc w:val="left"/>
+            </w:pPr>
+            <w:r>
+              <w:t xml:space="preserve">Static-AE+FT (matched)</w:t>
+            </w:r>
+          </w:p>
+        </w:tc>
+        <w:tc>
+          <w:tcPr/>
+          <w:p>
+            <w:pPr>
+              <w:pStyle w:val="Compact"/>
+              <w:jc w:val="left"/>
+            </w:pPr>
+            <w:r>
+              <w:t xml:space="preserve">0.769 ± 0.009</w:t>
+            </w:r>
+          </w:p>
+        </w:tc>
+        <w:tc>
+          <w:tcPr/>
+          <w:p>
+            <w:pPr>
+              <w:pStyle w:val="Compact"/>
+              <w:jc w:val="left"/>
+            </w:pPr>
+            <w:r>
+              <w:t xml:space="preserve">0.101 ± 0.013</w:t>
+            </w:r>
+          </w:p>
+        </w:tc>
+        <w:tc>
+          <w:tcPr/>
+          <w:p>
+            <w:pPr>
+              <w:pStyle w:val="Compact"/>
+              <w:jc w:val="left"/>
+            </w:pPr>
+            <w:r>
+              <w:t xml:space="preserve">0.319 ± 0.008</w:t>
+            </w:r>
+          </w:p>
+        </w:tc>
+        <w:tc>
+          <w:tcPr/>
+          <w:p>
+            <w:pPr>
+              <w:pStyle w:val="Compact"/>
+              <w:jc w:val="left"/>
+            </w:pPr>
+            <w:r>
+              <w:t xml:space="preserve">0.250 ± 0.064</w:t>
+            </w:r>
+          </w:p>
+        </w:tc>
+        <w:tc>
+          <w:tcPr/>
+          <w:p>
+            <w:pPr>
+              <w:pStyle w:val="Compact"/>
+              <w:jc w:val="left"/>
+            </w:pPr>
+            <w:r>
+              <w:t xml:space="preserve">0.288 ± 0.058</w:t>
+            </w:r>
+          </w:p>
+        </w:tc>
+      </w:tr>
+      <w:tr>
+        <w:tc>
+          <w:tcPr/>
+          <w:p>
+            <w:pPr>
+              <w:pStyle w:val="Compact"/>
+              <w:jc w:val="left"/>
+            </w:pPr>
+            <w:r>
+              <w:t xml:space="preserve">MAML-AE, no adaptation</w:t>
+            </w:r>
+          </w:p>
+        </w:tc>
+        <w:tc>
+          <w:tcPr/>
+          <w:p>
+            <w:pPr>
+              <w:pStyle w:val="Compact"/>
+              <w:jc w:val="left"/>
+            </w:pPr>
+            <w:r>
+              <w:t xml:space="preserve">0.764 ± 0.003</w:t>
+            </w:r>
+          </w:p>
+        </w:tc>
+        <w:tc>
+          <w:tcPr/>
+          <w:p>
+            <w:pPr>
+              <w:pStyle w:val="Compact"/>
+              <w:jc w:val="left"/>
+            </w:pPr>
+            <w:r>
+              <w:t xml:space="preserve">0.114 ± 0.026</w:t>
+            </w:r>
+          </w:p>
+        </w:tc>
+        <w:tc>
+          <w:tcPr/>
+          <w:p>
+            <w:pPr>
+              <w:pStyle w:val="Compact"/>
+              <w:jc w:val="left"/>
+            </w:pPr>
+            <w:r>
+              <w:t xml:space="preserve">0.288 ± 0.004</w:t>
+            </w:r>
+          </w:p>
+        </w:tc>
+        <w:tc>
+          <w:tcPr/>
+          <w:p>
+            <w:pPr>
+              <w:pStyle w:val="Compact"/>
+              <w:jc w:val="left"/>
+            </w:pPr>
+            <w:r>
+              <w:t xml:space="preserve">0.226 ± 0.050</w:t>
+            </w:r>
+          </w:p>
+        </w:tc>
+        <w:tc>
+          <w:tcPr/>
+          <w:p>
+            <w:pPr>
+              <w:pStyle w:val="Compact"/>
+              <w:jc w:val="left"/>
+            </w:pPr>
+            <w:r>
+              <w:t xml:space="preserve">0.288 ± 0.059</w:t>
+            </w:r>
+          </w:p>
+        </w:tc>
+      </w:tr>
+      <w:tr>
+        <w:tc>
+          <w:tcPr/>
+          <w:p>
+            <w:pPr>
+              <w:pStyle w:val="Compact"/>
+              <w:jc w:val="left"/>
+            </w:pPr>
+            <w:r>
+              <w:t xml:space="preserve">MAML-AE (matched)</w:t>
+            </w:r>
+          </w:p>
+        </w:tc>
+        <w:tc>
+          <w:tcPr/>
+          <w:p>
+            <w:pPr>
+              <w:pStyle w:val="Compact"/>
+              <w:jc w:val="left"/>
+            </w:pPr>
+            <w:r>
+              <w:t xml:space="preserve">0.764 ± 0.004</w:t>
+            </w:r>
+          </w:p>
+        </w:tc>
+        <w:tc>
+          <w:tcPr/>
+          <w:p>
+            <w:pPr>
+              <w:pStyle w:val="Compact"/>
+              <w:jc w:val="left"/>
+            </w:pPr>
+            <w:r>
+              <w:t xml:space="preserve">0.116 ± 0.024</w:t>
+            </w:r>
+          </w:p>
+        </w:tc>
+        <w:tc>
+          <w:tcPr/>
+          <w:p>
+            <w:pPr>
+              <w:pStyle w:val="Compact"/>
+              <w:jc w:val="left"/>
+            </w:pPr>
+            <w:r>
+              <w:t xml:space="preserve">0.284 ± 0.006</w:t>
+            </w:r>
+          </w:p>
+        </w:tc>
+        <w:tc>
+          <w:tcPr/>
+          <w:p>
+            <w:pPr>
+              <w:pStyle w:val="Compact"/>
+              <w:jc w:val="left"/>
+            </w:pPr>
+            <w:r>
+              <w:t xml:space="preserve">0.237 ± 0.054</w:t>
+            </w:r>
+          </w:p>
+        </w:tc>
+        <w:tc>
+          <w:tcPr/>
+          <w:p>
+            <w:pPr>
+              <w:pStyle w:val="Compact"/>
+              <w:jc w:val="left"/>
+            </w:pPr>
+            <w:r>
+              <w:t xml:space="preserve">0.288 ± 0.060</w:t>
+            </w:r>
+          </w:p>
+        </w:tc>
+      </w:tr>
+      <w:tr>
+        <w:tc>
+          <w:tcPr/>
+          <w:p>
+            <w:pPr>
+              <w:pStyle w:val="Compact"/>
+              <w:jc w:val="left"/>
+            </w:pPr>
+            <w:r>
+              <w:t xml:space="preserve">MAML-AE (heavy)</w:t>
+            </w:r>
+          </w:p>
+        </w:tc>
+        <w:tc>
+          <w:tcPr/>
+          <w:p>
+            <w:pPr>
+              <w:pStyle w:val="Compact"/>
+              <w:jc w:val="left"/>
+            </w:pPr>
+            <w:r>
+              <w:t xml:space="preserve">0.762 ± 0.005</w:t>
+            </w:r>
+          </w:p>
+        </w:tc>
+        <w:tc>
+          <w:tcPr/>
+          <w:p>
+            <w:pPr>
+              <w:pStyle w:val="Compact"/>
+              <w:jc w:val="left"/>
+            </w:pPr>
+            <w:r>
+              <w:t xml:space="preserve">0.116 ± 0.022</w:t>
+            </w:r>
+          </w:p>
+        </w:tc>
+        <w:tc>
+          <w:tcPr/>
+          <w:p>
+            <w:pPr>
+              <w:pStyle w:val="Compact"/>
+              <w:jc w:val="left"/>
+            </w:pPr>
+            <w:r>
+              <w:t xml:space="preserve">0.283 ± 0.015</w:t>
+            </w:r>
+          </w:p>
+        </w:tc>
+        <w:tc>
+          <w:tcPr/>
+          <w:p>
+            <w:pPr>
+              <w:pStyle w:val="Compact"/>
+              <w:jc w:val="left"/>
+            </w:pPr>
+            <w:r>
+              <w:t xml:space="preserve">0.255 ± 0.064</w:t>
+            </w:r>
+          </w:p>
+        </w:tc>
+        <w:tc>
+          <w:tcPr/>
+          <w:p>
+            <w:pPr>
+              <w:pStyle w:val="Compact"/>
+              <w:jc w:val="left"/>
+            </w:pPr>
+            <w:r>
+              <w:t xml:space="preserve">0.288 ± 0.059</w:t>
+            </w:r>
+          </w:p>
+        </w:tc>
+      </w:tr>
+      <w:tr>
+        <w:tc>
+          <w:tcPr/>
+          <w:p>
+            <w:pPr>
+              <w:pStyle w:val="Compact"/>
+              <w:jc w:val="left"/>
+            </w:pPr>
+            <w:r>
+              <w:t xml:space="preserve">MAML-AE-broken (matched)</w:t>
+            </w:r>
+          </w:p>
+        </w:tc>
+        <w:tc>
+          <w:tcPr/>
+          <w:p>
+            <w:pPr>
+              <w:pStyle w:val="Compact"/>
+              <w:jc w:val="left"/>
+            </w:pPr>
+            <w:r>
+              <w:t xml:space="preserve">0.769 ± 0.000</w:t>
+            </w:r>
+          </w:p>
+        </w:tc>
+        <w:tc>
+          <w:tcPr/>
+          <w:p>
+            <w:pPr>
+              <w:pStyle w:val="Compact"/>
+              <w:jc w:val="left"/>
+            </w:pPr>
+            <w:r>
+              <w:t xml:space="preserve">0.180 ± 0.001</w:t>
+            </w:r>
+          </w:p>
+        </w:tc>
+        <w:tc>
+          <w:tcPr/>
+          <w:p>
+            <w:pPr>
+              <w:pStyle w:val="Compact"/>
+              <w:jc w:val="left"/>
+            </w:pPr>
+            <w:r>
+              <w:t xml:space="preserve">0.280 ± 0.001</w:t>
+            </w:r>
+          </w:p>
+        </w:tc>
+        <w:tc>
+          <w:tcPr/>
+          <w:p>
+            <w:pPr>
+              <w:pStyle w:val="Compact"/>
+              <w:jc w:val="left"/>
+            </w:pPr>
+            <w:r>
+              <w:t xml:space="preserve">0.241 ± 0.050</w:t>
+            </w:r>
+          </w:p>
+        </w:tc>
+        <w:tc>
+          <w:tcPr/>
+          <w:p>
+            <w:pPr>
+              <w:pStyle w:val="Compact"/>
+              <w:jc w:val="left"/>
+            </w:pPr>
+            <w:r>
+              <w:t xml:space="preserve">0.306 ± 0.054</w:t>
+            </w:r>
+          </w:p>
+        </w:tc>
+      </w:tr>
+      <w:tr>
+        <w:tc>
+          <w:tcPr/>
+          <w:p>
+            <w:pPr>
+              <w:pStyle w:val="Compact"/>
+              <w:jc w:val="left"/>
+            </w:pPr>
+            <w:r>
+              <w:t xml:space="preserve">Scratch (matched)</w:t>
+            </w:r>
+          </w:p>
+        </w:tc>
+        <w:tc>
+          <w:tcPr/>
+          <w:p>
+            <w:pPr>
+              <w:pStyle w:val="Compact"/>
+              <w:jc w:val="left"/>
+            </w:pPr>
+            <w:r>
+              <w:t xml:space="preserve">0.769 ± 0.000</w:t>
             </w:r>
           </w:p>
         </w:tc>
@@ -5568,18 +5780,6 @@
               <w:jc w:val="left"/>
             </w:pPr>
             <w:r>
-              <w:t xml:space="preserve">0.854 ± 0.001</w:t>
-            </w:r>
-          </w:p>
-        </w:tc>
-        <w:tc>
-          <w:tcPr/>
-          <w:p>
-            <w:pPr>
-              <w:pStyle w:val="Compact"/>
-              <w:jc w:val="left"/>
-            </w:pPr>
-            <w:r>
               <w:t xml:space="preserve">0.279 ± 0.001</w:t>
             </w:r>
           </w:p>
@@ -5592,31 +5792,7 @@
               <w:jc w:val="left"/>
             </w:pPr>
             <w:r>
-              <w:t xml:space="preserve">0.607 ± 0.033</w:t>
-            </w:r>
-          </w:p>
-        </w:tc>
-        <w:tc>
-          <w:tcPr/>
-          <w:p>
-            <w:pPr>
-              <w:pStyle w:val="Compact"/>
-              <w:jc w:val="left"/>
-            </w:pPr>
-            <w:r>
               <w:t xml:space="preserve">0.242 ± 0.049</w:t>
-            </w:r>
-          </w:p>
-        </w:tc>
-        <w:tc>
-          <w:tcPr/>
-          <w:p>
-            <w:pPr>
-              <w:pStyle w:val="Compact"/>
-              <w:jc w:val="left"/>
-            </w:pPr>
-            <w:r>
-              <w:t xml:space="preserve">0.609 ± 0.058</w:t>
             </w:r>
           </w:p>
         </w:tc>
@@ -5746,7 +5922,7 @@
         <w:pStyle w:val="FirstParagraph"/>
       </w:pPr>
       <w:r>
-        <w:t xml:space="preserve">Table 4 reports the three adaptation instruments pooled over datasets (per-dataset values are in Figure 3 and the released tables). At the draft setting, ten steps at 0.01, adaptation changes 0.2 % of the meta-model’s parameter norm and 0.1 % of the static model’s, and the rank correlation between scores before and after is 0.95–0.97 for the meta-model and 0.99 for the static one. The matched setting, the inner loop the meta-model was trained for, moves it by 0.5 % and reorders slightly more (ρ = 0.93–0.95). The heavy setting, fifty steps at 0.1, moves it by about 2 % and brings ρ down to 0.87–0.89, which is the only setting under which the evaluation ranking of windows changes in a way a reader would notice; on HAI the heavy setting takes ρ to 0.76 ± 0.13.</w:t>
+        <w:t xml:space="preserve">Table 5 reports the three adaptation instruments pooled over datasets (per-dataset values are in Figure 3 and the released tables). At the draft setting, ten steps at 0.01, adaptation changes 0.2 % of the meta-model’s parameter norm and 0.1 % of the static model’s, and the rank correlation between scores before and after is 0.95–0.97 for the meta-model and 0.99 for the static one. The matched setting, the inner loop the meta-model was trained for, moves it by 0.5 % and reorders slightly more (ρ = 0.93–0.95). The heavy setting, fifty steps at 0.1, moves it by about 2 % and brings ρ down to 0.87–0.89, which is the only setting under which the evaluation ranking of windows changes in a way a reader would notice; on HAI the heavy setting takes ρ to 0.76 ± 0.13.</w:t>
       </w:r>
     </w:p>
     <w:p>
@@ -5754,7 +5930,7 @@
         <w:pStyle w:val="BodyText"/>
       </w:pPr>
       <w:r>
-        <w:t xml:space="preserve">Table 4. Adaptation instruments pooled over the five datasets (mean ± sd over seeds of dataset means). ΔAUROC is relative to the same model before adaptation on the same cell.</w:t>
+        <w:t xml:space="preserve">Table 5. Adaptation instruments pooled over the five datasets (mean ± sd over seeds of dataset means). ΔAUROC is relative to the same model before adaptation on the same cell.</w:t>
       </w:r>
     </w:p>
     <w:tbl>
@@ -6757,7 +6933,7 @@
         <w:pStyle w:val="BodyText"/>
       </w:pPr>
       <w:r>
-        <w:t xml:space="preserve">The broken-loop model and the Scratch model show what adaptation does to a network that has never been trained. At the matched setting their parameters move by 0.3–0.4 % and their scores keep ρ = 1.000 with the magnitude reference; at the heavy setting they move by 2.5–4 %, more than any trained model, and still keep ρ ≥ 0.96. Five to fifty gradient steps on at most a hundred windows do not make a detector out of a random network, and they do not make a different detector out of a trained one.</w:t>
+        <w:t xml:space="preserve">The broken-loop model and the Scratch model show what adaptation does to a network that has never been trained. At the matched setting their parameters move by 0.3–0.4 % and their scores keep ρ = 1.000 with their own un-adapted scores, which are the magnitude reference; at the heavy setting they move by 2.5–4 %, more than any trained model, and still keep ρ ≥ 0.96. Five to fifty gradient steps on at most a hundred windows do not make a detector out of a random network, and they do not make a different detector out of a trained one.</w:t>
       </w:r>
     </w:p>
     <w:bookmarkEnd w:id="48"/>
@@ -6775,7 +6951,7 @@
         <w:pStyle w:val="FirstParagraph"/>
       </w:pPr>
       <w:r>
-        <w:t xml:space="preserve">Table 5 sets the point-wise F1 at the label-free threshold beside the oracle best F1 for four detectors. The gap is between 0.15 and 0.26 F1 on every dataset, and it dwarfs every difference between methods in Table 3. On SWaT the static autoencoder reaches F1 0.56 with the threshold calibrated after 20 or 100 support windows but 0.39–0.40 when calibrated after 1 or 5, because the 300-window calibration stretch then starts a few windows earlier and happens to include a short stretch of quieter operation; nothing about the model changed. On WADI every autoencoder alarms on about 60 % of the evaluation stream against an anomaly rate of 6 %, because the calibration stretch at the start of the attack recording is not representative of the rest of it, which is the natural drift of that recording that we have described elsewhere; the threshold, not the ranking, is why its F1 is 0.11. On HAI, SMAP and MSL the deployed F1 is 0.15–0.22 against oracle values of 0.30–0.46.</w:t>
+        <w:t xml:space="preserve">Table 6 sets the point-wise F1 at the label-free threshold beside the oracle best F1 for four detectors. The gap is 0.19 F1 on SWaT, 0.06–0.10 on WADI, 0.22–0.25 on HAI, 0.15–0.16 on SMAP and 0.12–0.13 on MSL, and on every dataset but WADI it dwarfs every difference between methods in Table 3. On SWaT the static autoencoder reaches F1 0.56 with the threshold calibrated after 20 or 100 support windows but 0.39–0.40 when calibrated after 1 or 5, because the 300-window calibration stretch then starts a few windows earlier and happens to include a short stretch of quieter operation; nothing about the model changed. On WADI every autoencoder alarms on about 60 % of the evaluation stream against an anomaly rate of 6 %, because the calibration stretch at the start of the attack recording is not representative of the rest of it, a drift inside the attack recording itself; the threshold, not the ranking, is why its F1 is 0.11. On HAI, SMAP and MSL the deployed F1 is 0.14–0.22 against oracle values of 0.30–0.46.</w:t>
       </w:r>
     </w:p>
     <w:p>
@@ -6783,7 +6959,7 @@
         <w:pStyle w:val="BodyText"/>
       </w:pPr>
       <w:r>
-        <w:t xml:space="preserve">Table 5. Deployed point-wise F1 at the peaks-over-threshold level against the oracle best F1, K = 20, mean over seeds. Alarm rate is the share of evaluation windows above the threshold; the anomaly rate is the share of labelled windows.</w:t>
+        <w:t xml:space="preserve">Table 6. Deployed point-wise F1 at the peaks-over-threshold level against the oracle best F1, K = 20, mean over seeds. Alarm rate is the share of evaluation windows above the threshold; the anomaly rate is the share of labelled windows.</w:t>
       </w:r>
     </w:p>
     <w:tbl>
@@ -8790,7 +8966,7 @@
         <w:pStyle w:val="FirstParagraph"/>
       </w:pPr>
       <w:r>
-        <w:t xml:space="preserve">Table 6 gives the six transfer directions at K = 20 and K = 100 (Figure 4 maps the K = 20 values). The target decides everything. With SWaT as target every model in the shared 32-component space, including the random network, is between 0.824 and 0.838, and the model trained on SWaT itself is at 0.835: in that space SWaT’s attacks are detected by magnitude, as they were in the native space, and there is nothing for transfer to transfer. With WADI as target every model, including the one trained on WADI, is between 0.47 and 0.55: the 32 components keep 91 % of WADI’s normal-operation variance but not the part of it that separates attacks, and no source helps. With HAI as target the two source-trained models reach 0.87 from either SWaT or WADI, against 0.895 for the target-trained model and 0.78 for the random network; this is the one direction in which pre-training on another plant carries over something that K target windows cannot supply.</w:t>
+        <w:t xml:space="preserve">Table 7 gives the six transfer directions at K = 20 and K = 100 (Figure 4 maps the K = 20 values). The target decides everything. With SWaT as target every model in the shared 32-component space, including the random network, is between 0.824 and 0.838, and the model trained on SWaT itself is at 0.835: in that space SWaT’s attacks are detected by magnitude, as they were in the native space, and there is nothing for transfer to transfer. With WADI as target every model, including the one trained on WADI, is between 0.47 and 0.55: the 32 components keep 91 % of WADI’s normal-operation variance but not the part of it that separates attacks, and no source helps. With HAI as target the two source-trained models reach 0.87 from either SWaT or WADI, against 0.895 for the target-trained model and 0.78 for the random network; this is the one direction in which pre-training on another plant carries over something that K target windows cannot supply.</w:t>
       </w:r>
     </w:p>
     <w:p>
@@ -8798,7 +8974,7 @@
         <w:pStyle w:val="BodyText"/>
       </w:pPr>
       <w:r>
-        <w:t xml:space="preserve">Table 6. Cross-plant transfer, AUROC on the target’s attack recording(s), mean ± sd over five seeds, matched adaptation. Source-static is the static autoencoder trained on the source plant and adapted on K target windows; MAML-transfer is the meta-model trained on the source plant’s regimes and adapted the same way.</w:t>
+        <w:t xml:space="preserve">Table 7. Cross-plant transfer, AUROC on the target’s attack recording(s), mean ± sd over five seeds, matched adaptation. Source-static is the static autoencoder trained on the source plant and adapted on K target windows; MAML-transfer is the meta-model trained on the source plant’s regimes and adapted the same way.</w:t>
       </w:r>
     </w:p>
     <w:tbl>
@@ -10000,7 +10176,7 @@
         <w:pStyle w:val="FirstParagraph"/>
       </w:pPr>
       <w:r>
-        <w:t xml:space="preserve">We asked whether a meta-learned LSTM autoencoder for few-shot anomaly detection trains, adapts and detects, and we measured each rather than inferring it from a score table. It trains, once a one-line gradient-path fault is fixed, and a control that leaves the fault in shows that the fault is invisible to every quantity usually reported except the size of the meta-update. It barely adapts: K-shot adaptation at the settings in use moves the network by less than one per cent and leaves the anomaly ranking essentially unchanged on all five benchmarks, with one dataset on which adaptation repairs a poor initialisation to the level of a static model. And it does not detect better than a static autoencoder within a plant or across plants, while on four of five benchmarks neither of them detects better than the squared magnitude of the standardised window. The deployed threshold, set without labels, costs 0.15–0.26 F1 against the oracle, more than any modelling choice in the study. We release the loaders, the meta-learner with its control, the runner and every table, and we propose that reports of meta-learned detectors include the five measurements that made these conclusions possible.</w:t>
+        <w:t xml:space="preserve">We asked whether a meta-learned LSTM autoencoder for few-shot anomaly detection trains, adapts and detects, and we measured each rather than inferring it from a score table. It trains, once a one-line gradient-path fault is fixed, and a control that leaves the fault in shows that the fault is invisible to every quantity usually reported except the size of the meta-update. It barely adapts: K-shot adaptation at the settings in use moves the network by less than one per cent and leaves the anomaly ranking essentially unchanged on all five benchmarks, with one dataset on which adaptation repairs a poor initialisation to the level of a static model. And it does not detect better than a static autoencoder within a plant or across plants, while on four of five benchmarks neither of them detects better than the squared magnitude of the standardised window. The deployed threshold, set without labels, costs 0.06–0.25 F1 against the oracle, which on four of the five benchmarks is more than any modelling choice in the study. We release the loaders, the meta-learner with its control, the runner and every table, and we propose that reports of meta-learned detectors include the five measurements that made these conclusions possible.</w:t>
       </w:r>
     </w:p>
     <w:bookmarkEnd w:id="65"/>
@@ -11512,13 +11688,51 @@
       </w:r>
     </w:p>
     <w:bookmarkEnd w:id="112"/>
-    <w:bookmarkStart w:id="114" w:name="ref-kermenov2023drift"/>
+    <w:bookmarkStart w:id="113" w:name="ref-gama2014drift"/>
     <w:p>
       <w:pPr>
         <w:pStyle w:val="Bibliography"/>
       </w:pPr>
       <w:r>
         <w:t xml:space="preserve">[29]</w:t>
+      </w:r>
+      <w:r>
+        <w:t xml:space="preserve"> </w:t>
+      </w:r>
+      <w:r>
+        <w:t xml:space="preserve">	</w:t>
+      </w:r>
+      <w:r>
+        <w:t xml:space="preserve">J. Gama, I. Žliobaitė, A. Bifet, M. Pechenizkiy, and A. Bouchachia,</w:t>
+      </w:r>
+      <w:r>
+        <w:t xml:space="preserve"> </w:t>
+      </w:r>
+      <w:r>
+        <w:t xml:space="preserve">“A survey on concept drift adaptation,”</w:t>
+      </w:r>
+      <w:r>
+        <w:t xml:space="preserve"> </w:t>
+      </w:r>
+      <w:r>
+        <w:rPr>
+          <w:iCs/>
+          <w:i/>
+        </w:rPr>
+        <w:t xml:space="preserve">ACM Computing Surveys</w:t>
+      </w:r>
+      <w:r>
+        <w:t xml:space="preserve">, vol. 46, no. 4, pp. 44:1–44:37, 2014.</w:t>
+      </w:r>
+    </w:p>
+    <w:bookmarkEnd w:id="113"/>
+    <w:bookmarkStart w:id="115" w:name="ref-kermenov2023drift"/>
+    <w:p>
+      <w:pPr>
+        <w:pStyle w:val="Bibliography"/>
+      </w:pPr>
+      <w:r>
+        <w:t xml:space="preserve">[30]</w:t>
       </w:r>
       <w:r>
         <w:t xml:space="preserve"> </w:t>
@@ -11551,7 +11765,7 @@
       <w:r>
         <w:t xml:space="preserve"> </w:t>
       </w:r>
-      <w:hyperlink r:id="rId113">
+      <w:hyperlink r:id="rId114">
         <w:r>
           <w:rPr>
             <w:rStyle w:val="Hyperlink"/>
@@ -11561,44 +11775,6 @@
       </w:hyperlink>
       <w:r>
         <w:t xml:space="preserve">.</w:t>
-      </w:r>
-    </w:p>
-    <w:bookmarkEnd w:id="114"/>
-    <w:bookmarkStart w:id="115" w:name="ref-gama2014drift"/>
-    <w:p>
-      <w:pPr>
-        <w:pStyle w:val="Bibliography"/>
-      </w:pPr>
-      <w:r>
-        <w:t xml:space="preserve">[30]</w:t>
-      </w:r>
-      <w:r>
-        <w:t xml:space="preserve"> </w:t>
-      </w:r>
-      <w:r>
-        <w:t xml:space="preserve">	</w:t>
-      </w:r>
-      <w:r>
-        <w:t xml:space="preserve">J. Gama, I. Žliobaitė, A. Bifet, M. Pechenizkiy, and A. Bouchachia,</w:t>
-      </w:r>
-      <w:r>
-        <w:t xml:space="preserve"> </w:t>
-      </w:r>
-      <w:r>
-        <w:t xml:space="preserve">“A survey on concept drift adaptation,”</w:t>
-      </w:r>
-      <w:r>
-        <w:t xml:space="preserve"> </w:t>
-      </w:r>
-      <w:r>
-        <w:rPr>
-          <w:iCs/>
-          <w:i/>
-        </w:rPr>
-        <w:t xml:space="preserve">ACM Computing Surveys</w:t>
-      </w:r>
-      <w:r>
-        <w:t xml:space="preserve">, vol. 46, no. 4, pp. 44:1–44:37, 2014.</w:t>
       </w:r>
     </w:p>
     <w:bookmarkEnd w:id="115"/>

</xml_diff>

<commit_message>
paper2: long meta-training variant (Section 5.7), final build; obj2 meta logs and tables tracked; README section
Co-Authored-By: Claude Fable 5.1 <noreply@anthropic.com>
Claude-Session: https://claude.ai/code/session_01BowwkLMYwXCaivyHiAeZQc
</commit_message>
<xml_diff>
--- a/paper2/manuscript.docx
+++ b/paper2/manuscript.docx
@@ -9922,7 +9922,7 @@
         <w:pStyle w:val="FirstParagraph"/>
       </w:pPr>
       <w:r>
-        <w:t xml:space="preserve">LONG_PLACEHOLDER</w:t>
+        <w:t xml:space="preserve">Table 2 left open whether 600 outer steps had simply stopped the meta-learner short. We therefore repeated the three testbeds with 3,000 outer steps for seeds 0 and 1, everything else unchanged, and compared with the same seeds of the main run. Five times the meta-training lowered the best post-adaptation validation loss from 0.46 to 0.33 on SWaT, 0.71 to 0.58 on WADI and 0.60 to 0.42 on HAI, so the meta-model was indeed still improving as a reconstructor; it remained 1.3 (HAI) to 2.7 (SWaT, WADI) times the static model’s validation loss. Detection did not follow. The AUROC of the matched meta-model moved from 0.855 to 0.862 on SWaT, 0.597 to 0.593 on WADI and 0.873 to 0.864 on HAI, against 0.865, 0.581 and 0.898 for the static model on the same seeds; the un-adapted meta-model moved by 0.002 to 0.007. The adaptation instruments were unchanged to the second decimal (relative parameter change 0.005–0.007 at the matched setting, rank correlation 0.90–1.00). Longer meta-training makes a better-reconstructing meta-model and the same detector.</w:t>
       </w:r>
     </w:p>
     <w:bookmarkEnd w:id="58"/>
@@ -10019,7 +10019,7 @@
         <w:pStyle w:val="FirstParagraph"/>
       </w:pPr>
       <w:r>
-        <w:t xml:space="preserve">It is tempting, when a meta-learner fails to help, to say that the tasks were too alike for meta-learning to have anything to learn across. We said it ourselves. The per-channel diversity scores over 120 telemetry cells do not support it: the correlation between the silhouette of a channel’s regimes and the meta-model’s gain over the static model is weakly negative. A more likely account is in Section 5.1: the meta-objective is the post-adaptation reconstruction loss on a held-out regime, and after 600 outer steps that loss is still far above what plain training on the pooled windows reaches, so the meta-model is a worse reconstructor that adaptation cannot repair in five steps. Section 5.7 tests whether more meta-training closes the gap. Either way, a diversity argument should come with a diversity measurement and a sample size, and when it does, in this case it fails.</w:t>
+        <w:t xml:space="preserve">It is tempting, when a meta-learner fails to help, to say that the tasks were too alike for meta-learning to have anything to learn across. We said it ourselves. The per-channel diversity scores over 120 telemetry cells do not support it: the correlation between the silhouette of a channel’s regimes and the meta-model’s gain over the static model is weakly negative. A more likely account is in Section 5.1: the meta-objective is the post-adaptation reconstruction loss on a held-out regime, and after 600 outer steps that loss is still far above what plain training on the pooled windows reaches, so the meta-model is a worse reconstructor that adaptation cannot repair in five steps. Section 5.7 showed that five times the meta-training narrows that gap without changing the detector, which points at the detector’s dependence on window magnitude (Section 5.2) rather than at the amount of training. Either way, a diversity argument should come with a diversity measurement and a sample size, and when it does, in this case it fails.</w:t>
       </w:r>
     </w:p>
     <w:bookmarkEnd w:id="61"/>
@@ -10157,7 +10157,7 @@
         <w:pStyle w:val="FirstParagraph"/>
       </w:pPr>
       <w:r>
-        <w:t xml:space="preserve">The detector is one architecture at one size, and the meta-learner is one first-order variant with fixed inner learning rates; MAML++ or Meta-SGD learn those rates and might adapt more, though they would meet the same ceiling from the magnitude reference. Meta-training was limited to 600 outer steps in the main study and 3,000 in Section 5.7, on CPU; longer or larger runs are possible but the gap to plain training (Table 2) is not a matter of a factor of two. The regime tasks come from one clustering method with one window summary; a different task construction could give the meta-learner different things to learn across, which is exactly the experiment the diversity instrument makes possible. The transfer bridge is a linear projection fitted on normal data, and the WADI result in particular shows that the bridge can destroy what the target’s attacks look like; a learned bridge might behave differently. The two testbeds contribute one attack recording each, so their numbers rest on five seeds of model training over the same stream, and their paired tests have 20 cells; the telemetry sets and HAI carry the statistical weight. Everything here is offline: the model is adapted once and scored on a fixed stream. Whether a detector that adapts repeatedly as a stream drifts needs meta-learning is a separate question with a separate protocol, and nothing in this paper settles it.</w:t>
+        <w:t xml:space="preserve">The detector is one architecture at one size, and the meta-learner is one first-order variant with fixed inner learning rates; MAML++ or Meta-SGD learn those rates and might adapt more, though they would meet the same ceiling from the magnitude reference. Meta-training was limited to 600 outer steps in the main study and 3,000 in Section 5.7, on CPU; the five-fold longer run changed the validation loss and not the detector, but a still longer run or a larger meta-batch has not been tried. The regime tasks come from one clustering method with one window summary; a different task construction could give the meta-learner different things to learn across, which is exactly the experiment the diversity instrument makes possible. The transfer bridge is a linear projection fitted on normal data, and the WADI result in particular shows that the bridge can destroy what the target’s attacks look like; a learned bridge might behave differently. The two testbeds contribute one attack recording each, so their numbers rest on five seeds of model training over the same stream, and their paired tests have 20 cells; the telemetry sets and HAI carry the statistical weight. Everything here is offline: the model is adapted once and scored on a fixed stream. Whether a detector that adapts repeatedly as a stream drifts needs meta-learning is a separate question with a separate protocol, and nothing in this paper settles it.</w:t>
       </w:r>
     </w:p>
     <w:bookmarkEnd w:id="63"/>

</xml_diff>